<commit_message>
Update the question bank document to the latest questions.
</commit_message>
<xml_diff>
--- a/docs/计算机学院学生第三支部答辩谈话题库.docx
+++ b/docs/计算机学院学生第三支部答辩谈话题库.docx
@@ -540,7 +540,7 @@
           <w:color w:val="1A1A1A"/>
           <w:sz w:val="24"/>
         </w:rPr>
-        <w:t>6. 俄乌冲突今年已经第几年了？</w:t>
+        <w:t>6. 中国共产党的根本宗旨是什么？</w:t>
       </w:r>
     </w:p>
     <w:p>
@@ -555,7 +555,7 @@
           <w:color w:val="1A1A1A"/>
           <w:sz w:val="24"/>
         </w:rPr>
-        <w:t>答案：第五年。2022年2月24日爆发，2026年2月24日已满四周年。</w:t>
+        <w:t>答案：全心全意为人民服务。</w:t>
       </w:r>
     </w:p>
     <w:p>
@@ -569,7 +569,7 @@
           <w:color w:val="1A1A1A"/>
           <w:sz w:val="24"/>
         </w:rPr>
-        <w:t>7. 2025年一季度中国GDP同比增长？</w:t>
+        <w:t>7. 入党誓词的内容是什么？</w:t>
       </w:r>
     </w:p>
     <w:p>
@@ -584,7 +584,7 @@
           <w:color w:val="1A1A1A"/>
           <w:sz w:val="24"/>
         </w:rPr>
-        <w:t>答案：5.4%</w:t>
+        <w:t>答案：我志愿加入中国共产党，拥护党的纲领，遵守党的章程，履行党员义务，执行党的决定，严守党的纪律，保守党的秘密，对党忠诚，积极工作，为共产主义奋斗终身，随时准备为党和人民牺牲一切，永不叛党。</w:t>
       </w:r>
     </w:p>
     <w:p>
@@ -598,7 +598,7 @@
           <w:color w:val="1A1A1A"/>
           <w:sz w:val="24"/>
         </w:rPr>
-        <w:t>8. 今年是第几号载人飞船发射升空？</w:t>
+        <w:t>8. 党的纪律主要包括哪几项？</w:t>
       </w:r>
     </w:p>
     <w:p>
@@ -613,7 +613,7 @@
           <w:color w:val="1A1A1A"/>
           <w:sz w:val="24"/>
         </w:rPr>
-        <w:t>答案：神舟二十三号。2026年5月24日发射。</w:t>
+        <w:t>答案：政治纪律、组织纪律、廉洁纪律、群众纪律、工作纪律、生活纪律。</w:t>
       </w:r>
     </w:p>
     <w:p>

</xml_diff>

<commit_message>
Fix the hot topic and draw one hard question plus one 20th Congress question.
The shared current-affairs item is now a single fixed question. Each of the 17 students gets a hard question, a 20th Congress question, and two open questions, with party-member names assigned by quota.
</commit_message>
<xml_diff>
--- a/docs/计算机学院学生第三支部答辩谈话题库.docx
+++ b/docs/计算机学院学生第三支部答辩谈话题库.docx
@@ -58,7 +58,7 @@
           <w:color w:val="1A1A1A"/>
           <w:sz w:val="24"/>
         </w:rPr>
-        <w:t>说明：时事热点全员同题。个人题每人 6 道，为 1 道难题或二十大题、2 道其他党章题、3 道单独提问。单独提问中，询问对前面同学印象的题目不抽给第一位。</w:t>
+        <w:t>说明：本场 17 人。时事热点全场固定一道。个人题每人 4 道，依次为 1 道党章难题、1 道二十大题、2 道单独提问。单独提问中，询问对前面同学印象的题目不抽给第一位。</w:t>
       </w:r>
     </w:p>
     <w:p>
@@ -72,7 +72,7 @@
           <w:color w:val="1A1A1A"/>
           <w:sz w:val="32"/>
         </w:rPr>
-        <w:t>一、时事热点（3 题）</w:t>
+        <w:t>一、时事热点（1 题）</w:t>
       </w:r>
     </w:p>
     <w:p>
@@ -86,7 +86,7 @@
           <w:color w:val="1A1A1A"/>
           <w:sz w:val="24"/>
         </w:rPr>
-        <w:t>全员同题，只抽一次。</w:t>
+        <w:t>全场固定这一道，全员回答，不更换。</w:t>
       </w:r>
     </w:p>
     <w:p>
@@ -100,7 +100,7 @@
           <w:color w:val="1A1A1A"/>
           <w:sz w:val="24"/>
         </w:rPr>
-        <w:t>1. 2026年10月，中共中央、国务院印发《关于发展新质生产力的意见》，围绕科技创新、产业融合、发展方式、体制机制、人才工作五个方面部署19项重点举措，突出强调全面实施“人工智能+”行动，并前瞻布局量子科技、生物制造、氢能与核聚变、脑机接口、具身智能、6G等未来产业。分析该意见对推动经济高质量发展的积极意义。</w:t>
+        <w:t>1. 2026年10月16日，国务院常务会议听取“人工智能+”行动进展情况汇报，指出人工智能是影响未来发展的关键变量，强调从产业体系完备、应用场景丰富、工程化能力强的实际出发，以落地应用牵引技术创新，夯实算力、算法和数据底座，并统筹发展和安全。分析深化拓展“人工智能+”行动对推动经济高质量发展的积极意义。</w:t>
       </w:r>
     </w:p>
     <w:p>
@@ -115,7 +115,7 @@
           <w:color w:val="1A1A1A"/>
           <w:sz w:val="24"/>
         </w:rPr>
-        <w:t>答案：① 以科技创新引领新质生产力，夯实高质量发展根基：意见把大力推进科技创新放在首位，强调加强原创性颠覆性创新、突破关键核心技术、强化企业主体地位，推动全要素生产率大幅提升。</w:t>
+        <w:t>答案：① 以应用牵引创新，把技术变成现实生产力：从产业体系完备、场景丰富、工程化能力强的实际出发，鼓励联合研发和中试验证，推动人工智能改造制造、医疗、交通等实体经济，提高全要素生产率。</w:t>
       </w:r>
     </w:p>
     <w:p>
@@ -130,7 +130,7 @@
           <w:color w:val="1A1A1A"/>
           <w:sz w:val="24"/>
         </w:rPr>
-        <w:t>② 全面实施“人工智能+”行动，加速产业智能化升级：推动AI改造传统产业，加快智能网联新能源汽车、AI手机电脑、人形机器人等新一代智能终端应用，促进实体经济与数字经济深度融合。</w:t>
+        <w:t>② 夯实发展底座，补齐高质量发展短板：加强技术攻关和算法创新，促进算电协同，增加高质量数据供给，既补短板也锻长板，避免只搞概念、不落地。</w:t>
       </w:r>
     </w:p>
     <w:p>
@@ -145,7 +145,7 @@
           <w:color w:val="1A1A1A"/>
           <w:sz w:val="24"/>
         </w:rPr>
-        <w:t>③ 统筹传统产业升级与新兴、未来产业培育：既强调改造提升传统产业守牢实体经济根基，又培育壮大新兴支柱产业，前瞻布局六大未来产业，避免“脱实向虚”和泡沫化。</w:t>
+        <w:t>③ 突出赋能应用，培育新动能：以实体经济为重点做好供需衔接，把智能网联汽车、智能终端、工业质检、智慧医疗等场景做深，形成新的增长点。</w:t>
       </w:r>
     </w:p>
     <w:p>
@@ -160,7 +160,7 @@
           <w:color w:val="1A1A1A"/>
           <w:sz w:val="24"/>
         </w:rPr>
-        <w:t>④ 完善体制机制与人才支撑：通过金融创新、研发准备金、人才流动等改革，壮大耐心资本，培养急需人才，为新质生产力发展提供制度保障。</w:t>
+        <w:t>④ 统筹发展和安全，守住底线：按行业分级分类施策，加强风险研判，保证人工智能安全、可靠、可控，防止技术滥用冲击就业、数据和公共安全。</w:t>
       </w:r>
     </w:p>
     <w:p>
@@ -175,27 +175,26 @@
           <w:color w:val="1A1A1A"/>
           <w:sz w:val="24"/>
         </w:rPr>
-        <w:t>⑤ 统筹发展与安全、因地制宜、先立后破：明确AI安全可靠可控，严禁一哄而上盲目投资，确保新质生产力发展行稳致远，服务中国式现代化。</w:t>
+        <w:t>⑤ 服务“十五五”开局和中国式现代化：这次部署是对10月9日《关于发展新质生产力的意见》的接续落实，有利于建设现代化产业体系，为高质量发展提供新动能。</w:t>
       </w:r>
     </w:p>
     <w:p>
       <w:pPr>
-        <w:spacing w:before="160" w:after="40"/>
+        <w:spacing w:before="280" w:after="40"/>
       </w:pPr>
       <w:r>
         <w:rPr>
-          <w:rFonts w:ascii="宋体" w:hAnsi="宋体" w:eastAsia="宋体"/>
+          <w:rFonts w:ascii="黑体" w:hAnsi="黑体" w:eastAsia="黑体"/>
           <w:b/>
           <w:color w:val="1A1A1A"/>
-          <w:sz w:val="24"/>
+          <w:sz w:val="32"/>
         </w:rPr>
-        <w:t>2. 党的二十届五中全会将于2026年10月26日至29日在北京召开，核心议题是持之以恒推进全面从严治党（审议相关决定）。结合当前“十五五”开局之年形势，分析全面从严治党对保障高质量发展、推进中国式现代化的重要意义。</w:t>
+        <w:t>二、党章 · 难（17 题）</w:t>
       </w:r>
     </w:p>
     <w:p>
       <w:pPr>
-        <w:spacing w:before="0" w:after="0"/>
-        <w:ind w:left="425"/>
+        <w:spacing w:before="0" w:after="80"/>
       </w:pPr>
       <w:r>
         <w:rPr>
@@ -204,184 +203,7 @@
           <w:color w:val="1A1A1A"/>
           <w:sz w:val="24"/>
         </w:rPr>
-        <w:t>答案：① 为“十五五”规划落地提供坚强政治保障：四中全会已审议通过“十五五”规划建议，五中全会聚焦全面从严治党，就是从队伍和机制上确保蓝图能真正落地见效。</w:t>
-      </w:r>
-    </w:p>
-    <w:p>
-      <w:pPr>
-        <w:spacing w:before="0" w:after="0"/>
-        <w:ind w:left="425"/>
-      </w:pPr>
-      <w:r>
-        <w:rPr>
-          <w:rFonts w:ascii="宋体" w:hAnsi="宋体" w:eastAsia="宋体"/>
-          <w:b w:val="0"/>
-          <w:color w:val="1A1A1A"/>
-          <w:sz w:val="24"/>
-        </w:rPr>
-        <w:t>② 坚持和加强党的全面领导，落实“两个维护”：以更高标准推进全面从严治党，确保党中央重大决策部署不折不扣落实，聚焦新质生产力、现代化产业体系等重点任务加强监督。</w:t>
-      </w:r>
-    </w:p>
-    <w:p>
-      <w:pPr>
-        <w:spacing w:before="0" w:after="0"/>
-        <w:ind w:left="425"/>
-      </w:pPr>
-      <w:r>
-        <w:rPr>
-          <w:rFonts w:ascii="宋体" w:hAnsi="宋体" w:eastAsia="宋体"/>
-          <w:b w:val="0"/>
-          <w:color w:val="1A1A1A"/>
-          <w:sz w:val="24"/>
-        </w:rPr>
-        <w:t>③ 把权力关进制度笼子，营造风清气正政治生态：持续正风肃纪反腐，铲除腐败滋生土壤，解决形式主义、官僚主义问题，优化营商环境和基层治理。</w:t>
-      </w:r>
-    </w:p>
-    <w:p>
-      <w:pPr>
-        <w:spacing w:before="0" w:after="0"/>
-        <w:ind w:left="425"/>
-      </w:pPr>
-      <w:r>
-        <w:rPr>
-          <w:rFonts w:ascii="宋体" w:hAnsi="宋体" w:eastAsia="宋体"/>
-          <w:b w:val="0"/>
-          <w:color w:val="1A1A1A"/>
-          <w:sz w:val="24"/>
-        </w:rPr>
-        <w:t>④ 密切党群关系，夯实执政根基：通过严格管党治党，保障民生政策公平落实、公共资源不被截留，增强人民群众获得感，为高质量发展凝聚力量。</w:t>
-      </w:r>
-    </w:p>
-    <w:p>
-      <w:pPr>
-        <w:spacing w:before="0" w:after="0"/>
-        <w:ind w:left="425"/>
-      </w:pPr>
-      <w:r>
-        <w:rPr>
-          <w:rFonts w:ascii="宋体" w:hAnsi="宋体" w:eastAsia="宋体"/>
-          <w:b w:val="0"/>
-          <w:color w:val="1A1A1A"/>
-          <w:sz w:val="24"/>
-        </w:rPr>
-        <w:t>⑤ 以党的自我革命引领社会革命：全面从严治党永远在路上，为推进中国式现代化提供坚强领导核心和制度保障。</w:t>
-      </w:r>
-    </w:p>
-    <w:p>
-      <w:pPr>
-        <w:spacing w:before="160" w:after="40"/>
-      </w:pPr>
-      <w:r>
-        <w:rPr>
-          <w:rFonts w:ascii="宋体" w:hAnsi="宋体" w:eastAsia="宋体"/>
-          <w:b/>
-          <w:color w:val="1A1A1A"/>
-          <w:sz w:val="24"/>
-        </w:rPr>
-        <w:t>3. 2026年，我国新型储能累计装机规模突破1.5亿千瓦（较“十四五”初期增长约50倍），低空经济加速从试点走向商业化落地，新修订《民用航空法》首次系统规范低空经济。结合《关于发展新质生产力的意见》，分析新能源储能与低空经济发展对推动经济高质量发展的积极意义。</w:t>
-      </w:r>
-    </w:p>
-    <w:p>
-      <w:pPr>
-        <w:spacing w:before="0" w:after="0"/>
-        <w:ind w:left="425"/>
-      </w:pPr>
-      <w:r>
-        <w:rPr>
-          <w:rFonts w:ascii="宋体" w:hAnsi="宋体" w:eastAsia="宋体"/>
-          <w:b w:val="0"/>
-          <w:color w:val="1A1A1A"/>
-          <w:sz w:val="24"/>
-        </w:rPr>
-        <w:t>答案：① 保障能源安全与“双碳”目标：大规模储能有效解决新能源间歇性问题，支撑新型电力系统建设，推动能源结构绿色低碳转型。</w:t>
-      </w:r>
-    </w:p>
-    <w:p>
-      <w:pPr>
-        <w:spacing w:before="0" w:after="0"/>
-        <w:ind w:left="425"/>
-      </w:pPr>
-      <w:r>
-        <w:rPr>
-          <w:rFonts w:ascii="宋体" w:hAnsi="宋体" w:eastAsia="宋体"/>
-          <w:b w:val="0"/>
-          <w:color w:val="1A1A1A"/>
-          <w:sz w:val="24"/>
-        </w:rPr>
-        <w:t>② 培育新兴支柱产业：储能与低空经济已成为新兴支柱产业重要方向，带动电池材料、飞行器制造、运营服务等完整产业链，创造大量就业。</w:t>
-      </w:r>
-    </w:p>
-    <w:p>
-      <w:pPr>
-        <w:spacing w:before="0" w:after="0"/>
-        <w:ind w:left="425"/>
-      </w:pPr>
-      <w:r>
-        <w:rPr>
-          <w:rFonts w:ascii="宋体" w:hAnsi="宋体" w:eastAsia="宋体"/>
-          <w:b w:val="0"/>
-          <w:color w:val="1A1A1A"/>
-          <w:sz w:val="24"/>
-        </w:rPr>
-        <w:t>③ 提升资源配置效率与区域协调：储能支撑“西电东送”与算电协同；低空物流解决偏远地区配送难题，促进城乡区域协调发展。</w:t>
-      </w:r>
-    </w:p>
-    <w:p>
-      <w:pPr>
-        <w:spacing w:before="0" w:after="0"/>
-        <w:ind w:left="425"/>
-      </w:pPr>
-      <w:r>
-        <w:rPr>
-          <w:rFonts w:ascii="宋体" w:hAnsi="宋体" w:eastAsia="宋体"/>
-          <w:b w:val="0"/>
-          <w:color w:val="1A1A1A"/>
-          <w:sz w:val="24"/>
-        </w:rPr>
-        <w:t>④ 激发创新与新质生产力：推动材料、电力电子、飞行控制、智能避障等技术突破，以科技创新驱动产业高端化智能化。</w:t>
-      </w:r>
-    </w:p>
-    <w:p>
-      <w:pPr>
-        <w:spacing w:before="0" w:after="0"/>
-        <w:ind w:left="425"/>
-      </w:pPr>
-      <w:r>
-        <w:rPr>
-          <w:rFonts w:ascii="宋体" w:hAnsi="宋体" w:eastAsia="宋体"/>
-          <w:b w:val="0"/>
-          <w:color w:val="1A1A1A"/>
-          <w:sz w:val="24"/>
-        </w:rPr>
-        <w:t>⑤ 完善市场机制与安全监管：在确保安全前提下健康发展，避免内卷与泡沫，充分发挥市场在资源配置中的决定性作用。</w:t>
-      </w:r>
-    </w:p>
-    <w:p>
-      <w:pPr>
-        <w:spacing w:before="280" w:after="40"/>
-      </w:pPr>
-      <w:r>
-        <w:rPr>
-          <w:rFonts w:ascii="黑体" w:hAnsi="黑体" w:eastAsia="黑体"/>
-          <w:b/>
-          <w:color w:val="1A1A1A"/>
-          <w:sz w:val="32"/>
-        </w:rPr>
-        <w:t>二、党章 · 难（14 题）</w:t>
-      </w:r>
-    </w:p>
-    <w:p>
-      <w:pPr>
-        <w:spacing w:before="0" w:after="80"/>
-      </w:pPr>
-      <w:r>
-        <w:rPr>
-          <w:rFonts w:ascii="宋体" w:hAnsi="宋体" w:eastAsia="宋体"/>
-          <w:b w:val="0"/>
-          <w:color w:val="1A1A1A"/>
-          <w:sz w:val="24"/>
-        </w:rPr>
-        <w:t>与二十大题二选一，每人 1 道。</w:t>
+        <w:t>每人 1 道，作为个人题的第一道。</w:t>
       </w:r>
     </w:p>
     <w:p>
@@ -453,36 +275,7 @@
           <w:color w:val="1A1A1A"/>
           <w:sz w:val="24"/>
         </w:rPr>
-        <w:t>3. 新时代党的民族工作的主线是什么？</w:t>
-      </w:r>
-    </w:p>
-    <w:p>
-      <w:pPr>
-        <w:spacing w:before="0" w:after="0"/>
-        <w:ind w:left="425"/>
-      </w:pPr>
-      <w:r>
-        <w:rPr>
-          <w:rFonts w:ascii="宋体" w:hAnsi="宋体" w:eastAsia="宋体"/>
-          <w:b w:val="0"/>
-          <w:color w:val="1A1A1A"/>
-          <w:sz w:val="24"/>
-        </w:rPr>
-        <w:t>答案：铸牢中华民族共同体意识</w:t>
-      </w:r>
-    </w:p>
-    <w:p>
-      <w:pPr>
-        <w:spacing w:before="160" w:after="40"/>
-      </w:pPr>
-      <w:r>
-        <w:rPr>
-          <w:rFonts w:ascii="宋体" w:hAnsi="宋体" w:eastAsia="宋体"/>
-          <w:b/>
-          <w:color w:val="1A1A1A"/>
-          <w:sz w:val="24"/>
-        </w:rPr>
-        <w:t>4. 党面临的“四种危险”是什么？</w:t>
+        <w:t>3. 党面临的“四种危险”是什么？</w:t>
       </w:r>
     </w:p>
     <w:p>
@@ -511,7 +304,7 @@
           <w:color w:val="1A1A1A"/>
           <w:sz w:val="24"/>
         </w:rPr>
-        <w:t>5. 你知道“三牛精神”吗？</w:t>
+        <w:t>4. 你知道“三牛精神”吗？</w:t>
       </w:r>
     </w:p>
     <w:p>
@@ -540,65 +333,7 @@
           <w:color w:val="1A1A1A"/>
           <w:sz w:val="24"/>
         </w:rPr>
-        <w:t>6. 中国共产党的根本宗旨是什么？</w:t>
-      </w:r>
-    </w:p>
-    <w:p>
-      <w:pPr>
-        <w:spacing w:before="0" w:after="0"/>
-        <w:ind w:left="425"/>
-      </w:pPr>
-      <w:r>
-        <w:rPr>
-          <w:rFonts w:ascii="宋体" w:hAnsi="宋体" w:eastAsia="宋体"/>
-          <w:b w:val="0"/>
-          <w:color w:val="1A1A1A"/>
-          <w:sz w:val="24"/>
-        </w:rPr>
-        <w:t>答案：全心全意为人民服务。</w:t>
-      </w:r>
-    </w:p>
-    <w:p>
-      <w:pPr>
-        <w:spacing w:before="160" w:after="40"/>
-      </w:pPr>
-      <w:r>
-        <w:rPr>
-          <w:rFonts w:ascii="宋体" w:hAnsi="宋体" w:eastAsia="宋体"/>
-          <w:b/>
-          <w:color w:val="1A1A1A"/>
-          <w:sz w:val="24"/>
-        </w:rPr>
-        <w:t>7. 入党誓词的内容是什么？</w:t>
-      </w:r>
-    </w:p>
-    <w:p>
-      <w:pPr>
-        <w:spacing w:before="0" w:after="0"/>
-        <w:ind w:left="425"/>
-      </w:pPr>
-      <w:r>
-        <w:rPr>
-          <w:rFonts w:ascii="宋体" w:hAnsi="宋体" w:eastAsia="宋体"/>
-          <w:b w:val="0"/>
-          <w:color w:val="1A1A1A"/>
-          <w:sz w:val="24"/>
-        </w:rPr>
-        <w:t>答案：我志愿加入中国共产党，拥护党的纲领，遵守党的章程，履行党员义务，执行党的决定，严守党的纪律，保守党的秘密，对党忠诚，积极工作，为共产主义奋斗终身，随时准备为党和人民牺牲一切，永不叛党。</w:t>
-      </w:r>
-    </w:p>
-    <w:p>
-      <w:pPr>
-        <w:spacing w:before="160" w:after="40"/>
-      </w:pPr>
-      <w:r>
-        <w:rPr>
-          <w:rFonts w:ascii="宋体" w:hAnsi="宋体" w:eastAsia="宋体"/>
-          <w:b/>
-          <w:color w:val="1A1A1A"/>
-          <w:sz w:val="24"/>
-        </w:rPr>
-        <w:t>8. 党的纪律主要包括哪几项？</w:t>
+        <w:t>5. 党的纪律主要包括哪几项？</w:t>
       </w:r>
     </w:p>
     <w:p>
@@ -627,7 +362,7 @@
           <w:color w:val="1A1A1A"/>
           <w:sz w:val="24"/>
         </w:rPr>
-        <w:t>9. 中央八项规定精神的内容？</w:t>
+        <w:t>6. 什么是“三会一课”？</w:t>
       </w:r>
     </w:p>
     <w:p>
@@ -642,7 +377,7 @@
           <w:color w:val="1A1A1A"/>
           <w:sz w:val="24"/>
         </w:rPr>
-        <w:t>答案：改进调查研究、精简会议活动、精简文件简报、规范出访活动、改进警卫工作、改进新闻报道、严格文稿发表、厉行勤俭节约</w:t>
+        <w:t>答案：“三会”指定期召开支部党员大会、党支部委员会和党小组会，“一课”指按时上好党课。</w:t>
       </w:r>
     </w:p>
     <w:p>
@@ -656,7 +391,7 @@
           <w:color w:val="1A1A1A"/>
           <w:sz w:val="24"/>
         </w:rPr>
-        <w:t>10. “四个意识”是什么？</w:t>
+        <w:t>7. “四个意识”是什么？</w:t>
       </w:r>
     </w:p>
     <w:p>
@@ -685,7 +420,7 @@
           <w:color w:val="1A1A1A"/>
           <w:sz w:val="24"/>
         </w:rPr>
-        <w:t>11. “四个伟大”是什么？</w:t>
+        <w:t>8. “四个伟大”是什么？</w:t>
       </w:r>
     </w:p>
     <w:p>
@@ -714,7 +449,7 @@
           <w:color w:val="1A1A1A"/>
           <w:sz w:val="24"/>
         </w:rPr>
-        <w:t>12. 党的三大作风是什么？</w:t>
+        <w:t>9. 党的三大作风是什么？</w:t>
       </w:r>
     </w:p>
     <w:p>
@@ -743,7 +478,7 @@
           <w:color w:val="1A1A1A"/>
           <w:sz w:val="24"/>
         </w:rPr>
-        <w:t>13. “四个服从”是什么？</w:t>
+        <w:t>10. “四个服从”是什么？</w:t>
       </w:r>
     </w:p>
     <w:p>
@@ -772,7 +507,7 @@
           <w:color w:val="1A1A1A"/>
           <w:sz w:val="24"/>
         </w:rPr>
-        <w:t>14. 党面临的“四种考验”是什么？</w:t>
+        <w:t>11. 党面临的“四种考验”是什么？</w:t>
       </w:r>
     </w:p>
     <w:p>
@@ -792,6 +527,180 @@
     </w:p>
     <w:p>
       <w:pPr>
+        <w:spacing w:before="160" w:after="40"/>
+      </w:pPr>
+      <w:r>
+        <w:rPr>
+          <w:rFonts w:ascii="宋体" w:hAnsi="宋体" w:eastAsia="宋体"/>
+          <w:b/>
+          <w:color w:val="1A1A1A"/>
+          <w:sz w:val="24"/>
+        </w:rPr>
+        <w:t>12. 伟大建党精神的内涵是什么？</w:t>
+      </w:r>
+    </w:p>
+    <w:p>
+      <w:pPr>
+        <w:spacing w:before="0" w:after="0"/>
+        <w:ind w:left="425"/>
+      </w:pPr>
+      <w:r>
+        <w:rPr>
+          <w:rFonts w:ascii="宋体" w:hAnsi="宋体" w:eastAsia="宋体"/>
+          <w:b w:val="0"/>
+          <w:color w:val="1A1A1A"/>
+          <w:sz w:val="24"/>
+        </w:rPr>
+        <w:t>答案：坚持真理、坚守理想，践行初心、担当使命，不怕牺牲、英勇斗争，对党忠诚、不负人民。</w:t>
+      </w:r>
+    </w:p>
+    <w:p>
+      <w:pPr>
+        <w:spacing w:before="160" w:after="40"/>
+      </w:pPr>
+      <w:r>
+        <w:rPr>
+          <w:rFonts w:ascii="宋体" w:hAnsi="宋体" w:eastAsia="宋体"/>
+          <w:b/>
+          <w:color w:val="1A1A1A"/>
+          <w:sz w:val="24"/>
+        </w:rPr>
+        <w:t>13. “两个结合”是什么？</w:t>
+      </w:r>
+    </w:p>
+    <w:p>
+      <w:pPr>
+        <w:spacing w:before="0" w:after="0"/>
+        <w:ind w:left="425"/>
+      </w:pPr>
+      <w:r>
+        <w:rPr>
+          <w:rFonts w:ascii="宋体" w:hAnsi="宋体" w:eastAsia="宋体"/>
+          <w:b w:val="0"/>
+          <w:color w:val="1A1A1A"/>
+          <w:sz w:val="24"/>
+        </w:rPr>
+        <w:t>答案：把马克思主义基本原理同中国具体实际相结合、同中华优秀传统文化相结合。</w:t>
+      </w:r>
+    </w:p>
+    <w:p>
+      <w:pPr>
+        <w:spacing w:before="160" w:after="40"/>
+      </w:pPr>
+      <w:r>
+        <w:rPr>
+          <w:rFonts w:ascii="宋体" w:hAnsi="宋体" w:eastAsia="宋体"/>
+          <w:b/>
+          <w:color w:val="1A1A1A"/>
+          <w:sz w:val="24"/>
+        </w:rPr>
+        <w:t>14. 党要增强的“四自能力”是什么？</w:t>
+      </w:r>
+    </w:p>
+    <w:p>
+      <w:pPr>
+        <w:spacing w:before="0" w:after="0"/>
+        <w:ind w:left="425"/>
+      </w:pPr>
+      <w:r>
+        <w:rPr>
+          <w:rFonts w:ascii="宋体" w:hAnsi="宋体" w:eastAsia="宋体"/>
+          <w:b w:val="0"/>
+          <w:color w:val="1A1A1A"/>
+          <w:sz w:val="24"/>
+        </w:rPr>
+        <w:t>答案：自我净化、自我完善、自我革新、自我提高。</w:t>
+      </w:r>
+    </w:p>
+    <w:p>
+      <w:pPr>
+        <w:spacing w:before="160" w:after="40"/>
+      </w:pPr>
+      <w:r>
+        <w:rPr>
+          <w:rFonts w:ascii="宋体" w:hAnsi="宋体" w:eastAsia="宋体"/>
+          <w:b/>
+          <w:color w:val="1A1A1A"/>
+          <w:sz w:val="24"/>
+        </w:rPr>
+        <w:t>15. “四风”问题主要指什么？</w:t>
+      </w:r>
+    </w:p>
+    <w:p>
+      <w:pPr>
+        <w:spacing w:before="0" w:after="0"/>
+        <w:ind w:left="425"/>
+      </w:pPr>
+      <w:r>
+        <w:rPr>
+          <w:rFonts w:ascii="宋体" w:hAnsi="宋体" w:eastAsia="宋体"/>
+          <w:b w:val="0"/>
+          <w:color w:val="1A1A1A"/>
+          <w:sz w:val="24"/>
+        </w:rPr>
+        <w:t>答案：形式主义、官僚主义、享乐主义、奢靡之风。</w:t>
+      </w:r>
+    </w:p>
+    <w:p>
+      <w:pPr>
+        <w:spacing w:before="160" w:after="40"/>
+      </w:pPr>
+      <w:r>
+        <w:rPr>
+          <w:rFonts w:ascii="宋体" w:hAnsi="宋体" w:eastAsia="宋体"/>
+          <w:b/>
+          <w:color w:val="1A1A1A"/>
+          <w:sz w:val="24"/>
+        </w:rPr>
+        <w:t>16. 党的纪律处分工作应当坚持哪些原则？</w:t>
+      </w:r>
+    </w:p>
+    <w:p>
+      <w:pPr>
+        <w:spacing w:before="0" w:after="0"/>
+        <w:ind w:left="425"/>
+      </w:pPr>
+      <w:r>
+        <w:rPr>
+          <w:rFonts w:ascii="宋体" w:hAnsi="宋体" w:eastAsia="宋体"/>
+          <w:b w:val="0"/>
+          <w:color w:val="1A1A1A"/>
+          <w:sz w:val="24"/>
+        </w:rPr>
+        <w:t>答案：① 党要管党、从严治党；② 党纪面前一律平等；③ 实事求是；④ 民主集中制；⑤ 惩前毖后、治病救人。</w:t>
+      </w:r>
+    </w:p>
+    <w:p>
+      <w:pPr>
+        <w:spacing w:before="160" w:after="40"/>
+      </w:pPr>
+      <w:r>
+        <w:rPr>
+          <w:rFonts w:ascii="宋体" w:hAnsi="宋体" w:eastAsia="宋体"/>
+          <w:b/>
+          <w:color w:val="1A1A1A"/>
+          <w:sz w:val="24"/>
+        </w:rPr>
+        <w:t>17. 加强和规范党内政治生活，要着力增强哪“四性”？</w:t>
+      </w:r>
+    </w:p>
+    <w:p>
+      <w:pPr>
+        <w:spacing w:before="0" w:after="0"/>
+        <w:ind w:left="425"/>
+      </w:pPr>
+      <w:r>
+        <w:rPr>
+          <w:rFonts w:ascii="宋体" w:hAnsi="宋体" w:eastAsia="宋体"/>
+          <w:b w:val="0"/>
+          <w:color w:val="1A1A1A"/>
+          <w:sz w:val="24"/>
+        </w:rPr>
+        <w:t>答案：政治性、时代性、原则性、战斗性。</w:t>
+      </w:r>
+    </w:p>
+    <w:p>
+      <w:pPr>
         <w:spacing w:before="280" w:after="40"/>
       </w:pPr>
       <w:r>
@@ -801,7 +710,7 @@
           <w:color w:val="1A1A1A"/>
           <w:sz w:val="32"/>
         </w:rPr>
-        <w:t>三、党章 · 二十大（14 题）</w:t>
+        <w:t>三、党章 · 二十大（17 题）</w:t>
       </w:r>
     </w:p>
     <w:p>
@@ -815,7 +724,7 @@
           <w:color w:val="1A1A1A"/>
           <w:sz w:val="24"/>
         </w:rPr>
-        <w:t>与难题二选一，每人 1 道。</w:t>
+        <w:t>每人 1 道，作为个人题的第二道。</w:t>
       </w:r>
     </w:p>
     <w:p>
@@ -1226,6 +1135,93 @@
     </w:p>
     <w:p>
       <w:pPr>
+        <w:spacing w:before="160" w:after="40"/>
+      </w:pPr>
+      <w:r>
+        <w:rPr>
+          <w:rFonts w:ascii="宋体" w:hAnsi="宋体" w:eastAsia="宋体"/>
+          <w:b/>
+          <w:color w:val="1A1A1A"/>
+          <w:sz w:val="24"/>
+        </w:rPr>
+        <w:t>15. 党的二十大明确的两步走战略安排是什么？</w:t>
+      </w:r>
+    </w:p>
+    <w:p>
+      <w:pPr>
+        <w:spacing w:before="0" w:after="0"/>
+        <w:ind w:left="425"/>
+      </w:pPr>
+      <w:r>
+        <w:rPr>
+          <w:rFonts w:ascii="宋体" w:hAnsi="宋体" w:eastAsia="宋体"/>
+          <w:b w:val="0"/>
+          <w:color w:val="1A1A1A"/>
+          <w:sz w:val="24"/>
+        </w:rPr>
+        <w:t>答案：从二〇二〇年到二〇三五年基本实现社会主义现代化；从二〇三五年到本世纪中叶把我国建成富强民主文明和谐美丽的社会主义现代化强国。</w:t>
+      </w:r>
+    </w:p>
+    <w:p>
+      <w:pPr>
+        <w:spacing w:before="160" w:after="40"/>
+      </w:pPr>
+      <w:r>
+        <w:rPr>
+          <w:rFonts w:ascii="宋体" w:hAnsi="宋体" w:eastAsia="宋体"/>
+          <w:b/>
+          <w:color w:val="1A1A1A"/>
+          <w:sz w:val="24"/>
+        </w:rPr>
+        <w:t>16. 中国共产党领导人民打江山、守江山，守的是什么？</w:t>
+      </w:r>
+    </w:p>
+    <w:p>
+      <w:pPr>
+        <w:spacing w:before="0" w:after="0"/>
+        <w:ind w:left="425"/>
+      </w:pPr>
+      <w:r>
+        <w:rPr>
+          <w:rFonts w:ascii="宋体" w:hAnsi="宋体" w:eastAsia="宋体"/>
+          <w:b w:val="0"/>
+          <w:color w:val="1A1A1A"/>
+          <w:sz w:val="24"/>
+        </w:rPr>
+        <w:t>答案：守的是人民的心。</w:t>
+      </w:r>
+    </w:p>
+    <w:p>
+      <w:pPr>
+        <w:spacing w:before="160" w:after="40"/>
+      </w:pPr>
+      <w:r>
+        <w:rPr>
+          <w:rFonts w:ascii="宋体" w:hAnsi="宋体" w:eastAsia="宋体"/>
+          <w:b/>
+          <w:color w:val="1A1A1A"/>
+          <w:sz w:val="24"/>
+        </w:rPr>
+        <w:t>17. 全面建设社会主义现代化国家、全面推进中华民族伟大复兴，关键在什么？</w:t>
+      </w:r>
+    </w:p>
+    <w:p>
+      <w:pPr>
+        <w:spacing w:before="0" w:after="0"/>
+        <w:ind w:left="425"/>
+      </w:pPr>
+      <w:r>
+        <w:rPr>
+          <w:rFonts w:ascii="宋体" w:hAnsi="宋体" w:eastAsia="宋体"/>
+          <w:b w:val="0"/>
+          <w:color w:val="1A1A1A"/>
+          <w:sz w:val="24"/>
+        </w:rPr>
+        <w:t>答案：关键在党。</w:t>
+      </w:r>
+    </w:p>
+    <w:p>
+      <w:pPr>
         <w:spacing w:before="280" w:after="40"/>
       </w:pPr>
       <w:r>
@@ -1235,7 +1231,7 @@
           <w:color w:val="1A1A1A"/>
           <w:sz w:val="32"/>
         </w:rPr>
-        <w:t>四、党章 · 其他（35 题）</w:t>
+        <w:t>四、党章 · 其他（34 题）</w:t>
       </w:r>
     </w:p>
     <w:p>
@@ -1249,7 +1245,7 @@
           <w:color w:val="1A1A1A"/>
           <w:sz w:val="24"/>
         </w:rPr>
-        <w:t>每人 2 道。</w:t>
+        <w:t>本场不抽，仅供查阅。</w:t>
       </w:r>
     </w:p>
     <w:p>
@@ -2220,36 +2216,7 @@
           <w:color w:val="1A1A1A"/>
           <w:sz w:val="24"/>
         </w:rPr>
-        <w:t>34. 什么是“三会一课”？</w:t>
-      </w:r>
-    </w:p>
-    <w:p>
-      <w:pPr>
-        <w:spacing w:before="0" w:after="0"/>
-        <w:ind w:left="425"/>
-      </w:pPr>
-      <w:r>
-        <w:rPr>
-          <w:rFonts w:ascii="宋体" w:hAnsi="宋体" w:eastAsia="宋体"/>
-          <w:b w:val="0"/>
-          <w:color w:val="1A1A1A"/>
-          <w:sz w:val="24"/>
-        </w:rPr>
-        <w:t>答案：“三会”指定期召开支部党员大会、党支部委员会和党小组会，“一课”指按时上好党课。</w:t>
-      </w:r>
-    </w:p>
-    <w:p>
-      <w:pPr>
-        <w:spacing w:before="160" w:after="40"/>
-      </w:pPr>
-      <w:r>
-        <w:rPr>
-          <w:rFonts w:ascii="宋体" w:hAnsi="宋体" w:eastAsia="宋体"/>
-          <w:b/>
-          <w:color w:val="1A1A1A"/>
-          <w:sz w:val="24"/>
-        </w:rPr>
-        <w:t>35. 党的根本组织原则是什么？</w:t>
+        <w:t>34. 党的根本组织原则是什么？</w:t>
       </w:r>
     </w:p>
     <w:p>
@@ -2278,7 +2245,7 @@
           <w:color w:val="1A1A1A"/>
           <w:sz w:val="32"/>
         </w:rPr>
-        <w:t>五、单独提问（42 题）</w:t>
+        <w:t>五、单独提问（51 题）</w:t>
       </w:r>
     </w:p>
     <w:p>
@@ -2292,7 +2259,7 @@
           <w:color w:val="1A1A1A"/>
           <w:sz w:val="24"/>
         </w:rPr>
-        <w:t>每人 3 道。其中询问对前面同学印象的题目，不抽给第一位。</w:t>
+        <w:t>每人 2 道。其中询问对前面同学印象的题目，不抽给第一位。</w:t>
       </w:r>
     </w:p>
     <w:p>
@@ -3496,6 +3463,267 @@
           <w:sz w:val="24"/>
         </w:rPr>
         <w:t>42. 请谈谈你对伟大建党精神的理解，以及它和你自身成长的关系。</w:t>
+      </w:r>
+    </w:p>
+    <w:p>
+      <w:pPr>
+        <w:spacing w:before="0" w:after="0"/>
+        <w:ind w:left="425"/>
+      </w:pPr>
+      <w:r>
+        <w:rPr>
+          <w:rFonts w:ascii="宋体" w:hAnsi="宋体" w:eastAsia="宋体"/>
+          <w:b w:val="0"/>
+          <w:color w:val="1A1A1A"/>
+          <w:sz w:val="24"/>
+        </w:rPr>
+        <w:t>答案：开放题，结合自身实际回答。</w:t>
+      </w:r>
+    </w:p>
+    <w:p>
+      <w:pPr>
+        <w:spacing w:before="160" w:after="40"/>
+      </w:pPr>
+      <w:r>
+        <w:rPr>
+          <w:rFonts w:ascii="宋体" w:hAnsi="宋体" w:eastAsia="宋体"/>
+          <w:b/>
+          <w:color w:val="1A1A1A"/>
+          <w:sz w:val="24"/>
+        </w:rPr>
+        <w:t>43. 你怎样理解“全心全意为人民服务”？准备在同学中怎么做？</w:t>
+      </w:r>
+    </w:p>
+    <w:p>
+      <w:pPr>
+        <w:spacing w:before="0" w:after="0"/>
+        <w:ind w:left="425"/>
+      </w:pPr>
+      <w:r>
+        <w:rPr>
+          <w:rFonts w:ascii="宋体" w:hAnsi="宋体" w:eastAsia="宋体"/>
+          <w:b w:val="0"/>
+          <w:color w:val="1A1A1A"/>
+          <w:sz w:val="24"/>
+        </w:rPr>
+        <w:t>答案：开放题，结合自身实际回答。</w:t>
+      </w:r>
+    </w:p>
+    <w:p>
+      <w:pPr>
+        <w:spacing w:before="160" w:after="40"/>
+      </w:pPr>
+      <w:r>
+        <w:rPr>
+          <w:rFonts w:ascii="宋体" w:hAnsi="宋体" w:eastAsia="宋体"/>
+          <w:b/>
+          <w:color w:val="1A1A1A"/>
+          <w:sz w:val="24"/>
+        </w:rPr>
+        <w:t>44. 如果看到同学考试作弊或学术不端，你会怎么处理？</w:t>
+      </w:r>
+    </w:p>
+    <w:p>
+      <w:pPr>
+        <w:spacing w:before="0" w:after="0"/>
+        <w:ind w:left="425"/>
+      </w:pPr>
+      <w:r>
+        <w:rPr>
+          <w:rFonts w:ascii="宋体" w:hAnsi="宋体" w:eastAsia="宋体"/>
+          <w:b w:val="0"/>
+          <w:color w:val="1A1A1A"/>
+          <w:sz w:val="24"/>
+        </w:rPr>
+        <w:t>答案：开放题，结合自身实际回答。</w:t>
+      </w:r>
+    </w:p>
+    <w:p>
+      <w:pPr>
+        <w:spacing w:before="160" w:after="40"/>
+      </w:pPr>
+      <w:r>
+        <w:rPr>
+          <w:rFonts w:ascii="宋体" w:hAnsi="宋体" w:eastAsia="宋体"/>
+          <w:b/>
+          <w:color w:val="1A1A1A"/>
+          <w:sz w:val="24"/>
+        </w:rPr>
+        <w:t>45. 你对“扣好人生第一粒扣子”怎么理解？</w:t>
+      </w:r>
+    </w:p>
+    <w:p>
+      <w:pPr>
+        <w:spacing w:before="0" w:after="0"/>
+        <w:ind w:left="425"/>
+      </w:pPr>
+      <w:r>
+        <w:rPr>
+          <w:rFonts w:ascii="宋体" w:hAnsi="宋体" w:eastAsia="宋体"/>
+          <w:b w:val="0"/>
+          <w:color w:val="1A1A1A"/>
+          <w:sz w:val="24"/>
+        </w:rPr>
+        <w:t>答案：开放题，结合自身实际回答。</w:t>
+      </w:r>
+    </w:p>
+    <w:p>
+      <w:pPr>
+        <w:spacing w:before="160" w:after="40"/>
+      </w:pPr>
+      <w:r>
+        <w:rPr>
+          <w:rFonts w:ascii="宋体" w:hAnsi="宋体" w:eastAsia="宋体"/>
+          <w:b/>
+          <w:color w:val="1A1A1A"/>
+          <w:sz w:val="24"/>
+        </w:rPr>
+        <w:t>46. 请谈谈你一次克服困难、完成集体任务的经历。</w:t>
+      </w:r>
+    </w:p>
+    <w:p>
+      <w:pPr>
+        <w:spacing w:before="0" w:after="0"/>
+        <w:ind w:left="425"/>
+      </w:pPr>
+      <w:r>
+        <w:rPr>
+          <w:rFonts w:ascii="宋体" w:hAnsi="宋体" w:eastAsia="宋体"/>
+          <w:b w:val="0"/>
+          <w:color w:val="1A1A1A"/>
+          <w:sz w:val="24"/>
+        </w:rPr>
+        <w:t>答案：开放题，结合自身实际回答。</w:t>
+      </w:r>
+    </w:p>
+    <w:p>
+      <w:pPr>
+        <w:spacing w:before="160" w:after="40"/>
+      </w:pPr>
+      <w:r>
+        <w:rPr>
+          <w:rFonts w:ascii="宋体" w:hAnsi="宋体" w:eastAsia="宋体"/>
+          <w:b/>
+          <w:color w:val="1A1A1A"/>
+          <w:sz w:val="24"/>
+        </w:rPr>
+        <w:t>47. 你如何看待网络上的历史虚无主义？</w:t>
+      </w:r>
+    </w:p>
+    <w:p>
+      <w:pPr>
+        <w:spacing w:before="0" w:after="0"/>
+        <w:ind w:left="425"/>
+      </w:pPr>
+      <w:r>
+        <w:rPr>
+          <w:rFonts w:ascii="宋体" w:hAnsi="宋体" w:eastAsia="宋体"/>
+          <w:b w:val="0"/>
+          <w:color w:val="1A1A1A"/>
+          <w:sz w:val="24"/>
+        </w:rPr>
+        <w:t>答案：开放题，结合自身实际回答。</w:t>
+      </w:r>
+    </w:p>
+    <w:p>
+      <w:pPr>
+        <w:spacing w:before="160" w:after="40"/>
+      </w:pPr>
+      <w:r>
+        <w:rPr>
+          <w:rFonts w:ascii="宋体" w:hAnsi="宋体" w:eastAsia="宋体"/>
+          <w:b/>
+          <w:color w:val="1A1A1A"/>
+          <w:sz w:val="24"/>
+        </w:rPr>
+        <w:t>48. 如果入党后岗位平凡，你怎样保持先进性？</w:t>
+      </w:r>
+    </w:p>
+    <w:p>
+      <w:pPr>
+        <w:spacing w:before="0" w:after="0"/>
+        <w:ind w:left="425"/>
+      </w:pPr>
+      <w:r>
+        <w:rPr>
+          <w:rFonts w:ascii="宋体" w:hAnsi="宋体" w:eastAsia="宋体"/>
+          <w:b w:val="0"/>
+          <w:color w:val="1A1A1A"/>
+          <w:sz w:val="24"/>
+        </w:rPr>
+        <w:t>答案：开放题，结合自身实际回答。</w:t>
+      </w:r>
+    </w:p>
+    <w:p>
+      <w:pPr>
+        <w:spacing w:before="160" w:after="40"/>
+      </w:pPr>
+      <w:r>
+        <w:rPr>
+          <w:rFonts w:ascii="宋体" w:hAnsi="宋体" w:eastAsia="宋体"/>
+          <w:b/>
+          <w:color w:val="1A1A1A"/>
+          <w:sz w:val="24"/>
+        </w:rPr>
+        <w:t>49. 你觉得自己在理论学习上最薄弱的是哪一块？打算怎么补？</w:t>
+      </w:r>
+    </w:p>
+    <w:p>
+      <w:pPr>
+        <w:spacing w:before="0" w:after="0"/>
+        <w:ind w:left="425"/>
+      </w:pPr>
+      <w:r>
+        <w:rPr>
+          <w:rFonts w:ascii="宋体" w:hAnsi="宋体" w:eastAsia="宋体"/>
+          <w:b w:val="0"/>
+          <w:color w:val="1A1A1A"/>
+          <w:sz w:val="24"/>
+        </w:rPr>
+        <w:t>答案：开放题，结合自身实际回答。</w:t>
+      </w:r>
+    </w:p>
+    <w:p>
+      <w:pPr>
+        <w:spacing w:before="160" w:after="40"/>
+      </w:pPr>
+      <w:r>
+        <w:rPr>
+          <w:rFonts w:ascii="宋体" w:hAnsi="宋体" w:eastAsia="宋体"/>
+          <w:b/>
+          <w:color w:val="1A1A1A"/>
+          <w:sz w:val="24"/>
+        </w:rPr>
+        <w:t>50. 班级里出现利益分配不公，你会怎么做？</w:t>
+      </w:r>
+    </w:p>
+    <w:p>
+      <w:pPr>
+        <w:spacing w:before="0" w:after="0"/>
+        <w:ind w:left="425"/>
+      </w:pPr>
+      <w:r>
+        <w:rPr>
+          <w:rFonts w:ascii="宋体" w:hAnsi="宋体" w:eastAsia="宋体"/>
+          <w:b w:val="0"/>
+          <w:color w:val="1A1A1A"/>
+          <w:sz w:val="24"/>
+        </w:rPr>
+        <w:t>答案：开放题，结合自身实际回答。</w:t>
+      </w:r>
+    </w:p>
+    <w:p>
+      <w:pPr>
+        <w:spacing w:before="160" w:after="40"/>
+      </w:pPr>
+      <w:r>
+        <w:rPr>
+          <w:rFonts w:ascii="宋体" w:hAnsi="宋体" w:eastAsia="宋体"/>
+          <w:b/>
+          <w:color w:val="1A1A1A"/>
+          <w:sz w:val="24"/>
+        </w:rPr>
+        <w:t>51. 请结合一次组织生活，谈谈你的收获和不足。</w:t>
       </w:r>
     </w:p>
     <w:p>

</xml_diff>

<commit_message>
Remove the unused party-charter question pool.
Personal draws only use one hard question, one 20th Congress question, and two open questions.
</commit_message>
<xml_diff>
--- a/docs/计算机学院学生第三支部答辩谈话题库.docx
+++ b/docs/计算机学院学生第三支部答辩谈话题库.docx
@@ -1231,1021 +1231,7 @@
           <w:color w:val="1A1A1A"/>
           <w:sz w:val="32"/>
         </w:rPr>
-        <w:t>四、党章 · 其他（34 题）</w:t>
-      </w:r>
-    </w:p>
-    <w:p>
-      <w:pPr>
-        <w:spacing w:before="0" w:after="80"/>
-      </w:pPr>
-      <w:r>
-        <w:rPr>
-          <w:rFonts w:ascii="宋体" w:hAnsi="宋体" w:eastAsia="宋体"/>
-          <w:b w:val="0"/>
-          <w:color w:val="1A1A1A"/>
-          <w:sz w:val="24"/>
-        </w:rPr>
-        <w:t>本场不抽，仅供查阅。</w:t>
-      </w:r>
-    </w:p>
-    <w:p>
-      <w:pPr>
-        <w:spacing w:before="160" w:after="40"/>
-      </w:pPr>
-      <w:r>
-        <w:rPr>
-          <w:rFonts w:ascii="宋体" w:hAnsi="宋体" w:eastAsia="宋体"/>
-          <w:b/>
-          <w:color w:val="1A1A1A"/>
-          <w:sz w:val="24"/>
-        </w:rPr>
-        <w:t>1. 中国共产党的初心和使命是什么？</w:t>
-      </w:r>
-    </w:p>
-    <w:p>
-      <w:pPr>
-        <w:spacing w:before="0" w:after="0"/>
-        <w:ind w:left="425"/>
-      </w:pPr>
-      <w:r>
-        <w:rPr>
-          <w:rFonts w:ascii="宋体" w:hAnsi="宋体" w:eastAsia="宋体"/>
-          <w:b w:val="0"/>
-          <w:color w:val="1A1A1A"/>
-          <w:sz w:val="24"/>
-        </w:rPr>
-        <w:t>答案：为中国人民谋幸福，为中华民族谋复兴。</w:t>
-      </w:r>
-    </w:p>
-    <w:p>
-      <w:pPr>
-        <w:spacing w:before="160" w:after="40"/>
-      </w:pPr>
-      <w:r>
-        <w:rPr>
-          <w:rFonts w:ascii="宋体" w:hAnsi="宋体" w:eastAsia="宋体"/>
-          <w:b/>
-          <w:color w:val="1A1A1A"/>
-          <w:sz w:val="24"/>
-        </w:rPr>
-        <w:t>2. 党的最高理想和最终目标是？</w:t>
-      </w:r>
-    </w:p>
-    <w:p>
-      <w:pPr>
-        <w:spacing w:before="0" w:after="0"/>
-        <w:ind w:left="425"/>
-      </w:pPr>
-      <w:r>
-        <w:rPr>
-          <w:rFonts w:ascii="宋体" w:hAnsi="宋体" w:eastAsia="宋体"/>
-          <w:b w:val="0"/>
-          <w:color w:val="1A1A1A"/>
-          <w:sz w:val="24"/>
-        </w:rPr>
-        <w:t>答案：实现共产主义。</w:t>
-      </w:r>
-    </w:p>
-    <w:p>
-      <w:pPr>
-        <w:spacing w:before="160" w:after="40"/>
-      </w:pPr>
-      <w:r>
-        <w:rPr>
-          <w:rFonts w:ascii="宋体" w:hAnsi="宋体" w:eastAsia="宋体"/>
-          <w:b/>
-          <w:color w:val="1A1A1A"/>
-          <w:sz w:val="24"/>
-        </w:rPr>
-        <w:t>3. 中国共产党以哪些思想作为自己的行动指南？</w:t>
-      </w:r>
-    </w:p>
-    <w:p>
-      <w:pPr>
-        <w:spacing w:before="0" w:after="0"/>
-        <w:ind w:left="425"/>
-      </w:pPr>
-      <w:r>
-        <w:rPr>
-          <w:rFonts w:ascii="宋体" w:hAnsi="宋体" w:eastAsia="宋体"/>
-          <w:b w:val="0"/>
-          <w:color w:val="1A1A1A"/>
-          <w:sz w:val="24"/>
-        </w:rPr>
-        <w:t>答案：马克思列宁主义、毛泽东思想、邓小平理论、“三个代表”重要思想、科学发展观、习近平新时代中国特色社会主义思想。</w:t>
-      </w:r>
-    </w:p>
-    <w:p>
-      <w:pPr>
-        <w:spacing w:before="160" w:after="40"/>
-      </w:pPr>
-      <w:r>
-        <w:rPr>
-          <w:rFonts w:ascii="宋体" w:hAnsi="宋体" w:eastAsia="宋体"/>
-          <w:b/>
-          <w:color w:val="1A1A1A"/>
-          <w:sz w:val="24"/>
-        </w:rPr>
-        <w:t>4. “一带一路”建设原则是什么？</w:t>
-      </w:r>
-    </w:p>
-    <w:p>
-      <w:pPr>
-        <w:spacing w:before="0" w:after="0"/>
-        <w:ind w:left="425"/>
-      </w:pPr>
-      <w:r>
-        <w:rPr>
-          <w:rFonts w:ascii="宋体" w:hAnsi="宋体" w:eastAsia="宋体"/>
-          <w:b w:val="0"/>
-          <w:color w:val="1A1A1A"/>
-          <w:sz w:val="24"/>
-        </w:rPr>
-        <w:t>答案：共商、共建、共享</w:t>
-      </w:r>
-    </w:p>
-    <w:p>
-      <w:pPr>
-        <w:spacing w:before="160" w:after="40"/>
-      </w:pPr>
-      <w:r>
-        <w:rPr>
-          <w:rFonts w:ascii="宋体" w:hAnsi="宋体" w:eastAsia="宋体"/>
-          <w:b/>
-          <w:color w:val="1A1A1A"/>
-          <w:sz w:val="24"/>
-        </w:rPr>
-        <w:t>5. 我们党的立党之本、执政之基、力量之源是？</w:t>
-      </w:r>
-    </w:p>
-    <w:p>
-      <w:pPr>
-        <w:spacing w:before="0" w:after="0"/>
-        <w:ind w:left="425"/>
-      </w:pPr>
-      <w:r>
-        <w:rPr>
-          <w:rFonts w:ascii="宋体" w:hAnsi="宋体" w:eastAsia="宋体"/>
-          <w:b w:val="0"/>
-          <w:color w:val="1A1A1A"/>
-          <w:sz w:val="24"/>
-        </w:rPr>
-        <w:t>答案：始终做到“三个代表”。</w:t>
-      </w:r>
-    </w:p>
-    <w:p>
-      <w:pPr>
-        <w:spacing w:before="160" w:after="40"/>
-      </w:pPr>
-      <w:r>
-        <w:rPr>
-          <w:rFonts w:ascii="宋体" w:hAnsi="宋体" w:eastAsia="宋体"/>
-          <w:b/>
-          <w:color w:val="1A1A1A"/>
-          <w:sz w:val="24"/>
-        </w:rPr>
-        <w:t>6. 四个全面是什么？</w:t>
-      </w:r>
-    </w:p>
-    <w:p>
-      <w:pPr>
-        <w:spacing w:before="0" w:after="0"/>
-        <w:ind w:left="425"/>
-      </w:pPr>
-      <w:r>
-        <w:rPr>
-          <w:rFonts w:ascii="宋体" w:hAnsi="宋体" w:eastAsia="宋体"/>
-          <w:b w:val="0"/>
-          <w:color w:val="1A1A1A"/>
-          <w:sz w:val="24"/>
-        </w:rPr>
-        <w:t>答案：全面建设社会主义现代化国家、全面深化改革、全面依法治国、全面从严治党</w:t>
-      </w:r>
-    </w:p>
-    <w:p>
-      <w:pPr>
-        <w:spacing w:before="160" w:after="40"/>
-      </w:pPr>
-      <w:r>
-        <w:rPr>
-          <w:rFonts w:ascii="宋体" w:hAnsi="宋体" w:eastAsia="宋体"/>
-          <w:b/>
-          <w:color w:val="1A1A1A"/>
-          <w:sz w:val="24"/>
-        </w:rPr>
-        <w:t>7. 中国梦的本质是什么？</w:t>
-      </w:r>
-    </w:p>
-    <w:p>
-      <w:pPr>
-        <w:spacing w:before="0" w:after="0"/>
-        <w:ind w:left="425"/>
-      </w:pPr>
-      <w:r>
-        <w:rPr>
-          <w:rFonts w:ascii="宋体" w:hAnsi="宋体" w:eastAsia="宋体"/>
-          <w:b w:val="0"/>
-          <w:color w:val="1A1A1A"/>
-          <w:sz w:val="24"/>
-        </w:rPr>
-        <w:t>答案：国家富强、民族振兴、人民幸福。</w:t>
-      </w:r>
-    </w:p>
-    <w:p>
-      <w:pPr>
-        <w:spacing w:before="160" w:after="40"/>
-      </w:pPr>
-      <w:r>
-        <w:rPr>
-          <w:rFonts w:ascii="宋体" w:hAnsi="宋体" w:eastAsia="宋体"/>
-          <w:b/>
-          <w:color w:val="1A1A1A"/>
-          <w:sz w:val="24"/>
-        </w:rPr>
-        <w:t>8. “五位一体”总体布局是？</w:t>
-      </w:r>
-    </w:p>
-    <w:p>
-      <w:pPr>
-        <w:spacing w:before="0" w:after="0"/>
-        <w:ind w:left="425"/>
-      </w:pPr>
-      <w:r>
-        <w:rPr>
-          <w:rFonts w:ascii="宋体" w:hAnsi="宋体" w:eastAsia="宋体"/>
-          <w:b w:val="0"/>
-          <w:color w:val="1A1A1A"/>
-          <w:sz w:val="24"/>
-        </w:rPr>
-        <w:t>答案：经济建设、政治建设、文化建设、社会建设和生态文明建设五位一体，全面推进。</w:t>
-      </w:r>
-    </w:p>
-    <w:p>
-      <w:pPr>
-        <w:spacing w:before="160" w:after="40"/>
-      </w:pPr>
-      <w:r>
-        <w:rPr>
-          <w:rFonts w:ascii="宋体" w:hAnsi="宋体" w:eastAsia="宋体"/>
-          <w:b/>
-          <w:color w:val="1A1A1A"/>
-          <w:sz w:val="24"/>
-        </w:rPr>
-        <w:t>9. 党的最高领导机关是？</w:t>
-      </w:r>
-    </w:p>
-    <w:p>
-      <w:pPr>
-        <w:spacing w:before="0" w:after="0"/>
-        <w:ind w:left="425"/>
-      </w:pPr>
-      <w:r>
-        <w:rPr>
-          <w:rFonts w:ascii="宋体" w:hAnsi="宋体" w:eastAsia="宋体"/>
-          <w:b w:val="0"/>
-          <w:color w:val="1A1A1A"/>
-          <w:sz w:val="24"/>
-        </w:rPr>
-        <w:t>答案：党的全国代表大会和它所产生的中央委员会。</w:t>
-      </w:r>
-    </w:p>
-    <w:p>
-      <w:pPr>
-        <w:spacing w:before="160" w:after="40"/>
-      </w:pPr>
-      <w:r>
-        <w:rPr>
-          <w:rFonts w:ascii="宋体" w:hAnsi="宋体" w:eastAsia="宋体"/>
-          <w:b/>
-          <w:color w:val="1A1A1A"/>
-          <w:sz w:val="24"/>
-        </w:rPr>
-        <w:t>10. 党的地方各级领导机关是？</w:t>
-      </w:r>
-    </w:p>
-    <w:p>
-      <w:pPr>
-        <w:spacing w:before="0" w:after="0"/>
-        <w:ind w:left="425"/>
-      </w:pPr>
-      <w:r>
-        <w:rPr>
-          <w:rFonts w:ascii="宋体" w:hAnsi="宋体" w:eastAsia="宋体"/>
-          <w:b w:val="0"/>
-          <w:color w:val="1A1A1A"/>
-          <w:sz w:val="24"/>
-        </w:rPr>
-        <w:t>答案：党的地方各级代表大会和它们所产生的委员会。</w:t>
-      </w:r>
-    </w:p>
-    <w:p>
-      <w:pPr>
-        <w:spacing w:before="160" w:after="40"/>
-      </w:pPr>
-      <w:r>
-        <w:rPr>
-          <w:rFonts w:ascii="宋体" w:hAnsi="宋体" w:eastAsia="宋体"/>
-          <w:b/>
-          <w:color w:val="1A1A1A"/>
-          <w:sz w:val="24"/>
-        </w:rPr>
-        <w:t>11. 党的地方各级委员会全体会议，每年至少召开几次？</w:t>
-      </w:r>
-    </w:p>
-    <w:p>
-      <w:pPr>
-        <w:spacing w:before="0" w:after="0"/>
-        <w:ind w:left="425"/>
-      </w:pPr>
-      <w:r>
-        <w:rPr>
-          <w:rFonts w:ascii="宋体" w:hAnsi="宋体" w:eastAsia="宋体"/>
-          <w:b w:val="0"/>
-          <w:color w:val="1A1A1A"/>
-          <w:sz w:val="24"/>
-        </w:rPr>
-        <w:t>答案：两次</w:t>
-      </w:r>
-    </w:p>
-    <w:p>
-      <w:pPr>
-        <w:spacing w:before="160" w:after="40"/>
-      </w:pPr>
-      <w:r>
-        <w:rPr>
-          <w:rFonts w:ascii="宋体" w:hAnsi="宋体" w:eastAsia="宋体"/>
-          <w:b/>
-          <w:color w:val="1A1A1A"/>
-          <w:sz w:val="24"/>
-        </w:rPr>
-        <w:t>12. 什么是高质量发展的底色？</w:t>
-      </w:r>
-    </w:p>
-    <w:p>
-      <w:pPr>
-        <w:spacing w:before="0" w:after="0"/>
-        <w:ind w:left="425"/>
-      </w:pPr>
-      <w:r>
-        <w:rPr>
-          <w:rFonts w:ascii="宋体" w:hAnsi="宋体" w:eastAsia="宋体"/>
-          <w:b w:val="0"/>
-          <w:color w:val="1A1A1A"/>
-          <w:sz w:val="24"/>
-        </w:rPr>
-        <w:t>答案：绿色发展</w:t>
-      </w:r>
-    </w:p>
-    <w:p>
-      <w:pPr>
-        <w:spacing w:before="160" w:after="40"/>
-      </w:pPr>
-      <w:r>
-        <w:rPr>
-          <w:rFonts w:ascii="宋体" w:hAnsi="宋体" w:eastAsia="宋体"/>
-          <w:b/>
-          <w:color w:val="1A1A1A"/>
-          <w:sz w:val="24"/>
-        </w:rPr>
-        <w:t>13. 我们的强国之路是？</w:t>
-      </w:r>
-    </w:p>
-    <w:p>
-      <w:pPr>
-        <w:spacing w:before="0" w:after="0"/>
-        <w:ind w:left="425"/>
-      </w:pPr>
-      <w:r>
-        <w:rPr>
-          <w:rFonts w:ascii="宋体" w:hAnsi="宋体" w:eastAsia="宋体"/>
-          <w:b w:val="0"/>
-          <w:color w:val="1A1A1A"/>
-          <w:sz w:val="24"/>
-        </w:rPr>
-        <w:t>答案：坚持改革开放</w:t>
-      </w:r>
-    </w:p>
-    <w:p>
-      <w:pPr>
-        <w:spacing w:before="160" w:after="40"/>
-      </w:pPr>
-      <w:r>
-        <w:rPr>
-          <w:rFonts w:ascii="宋体" w:hAnsi="宋体" w:eastAsia="宋体"/>
-          <w:b/>
-          <w:color w:val="1A1A1A"/>
-          <w:sz w:val="24"/>
-        </w:rPr>
-        <w:t>14. 我们的立国之本是？</w:t>
-      </w:r>
-    </w:p>
-    <w:p>
-      <w:pPr>
-        <w:spacing w:before="0" w:after="0"/>
-        <w:ind w:left="425"/>
-      </w:pPr>
-      <w:r>
-        <w:rPr>
-          <w:rFonts w:ascii="宋体" w:hAnsi="宋体" w:eastAsia="宋体"/>
-          <w:b w:val="0"/>
-          <w:color w:val="1A1A1A"/>
-          <w:sz w:val="24"/>
-        </w:rPr>
-        <w:t>答案：坚持四项基本原则</w:t>
-      </w:r>
-    </w:p>
-    <w:p>
-      <w:pPr>
-        <w:spacing w:before="160" w:after="40"/>
-      </w:pPr>
-      <w:r>
-        <w:rPr>
-          <w:rFonts w:ascii="宋体" w:hAnsi="宋体" w:eastAsia="宋体"/>
-          <w:b/>
-          <w:color w:val="1A1A1A"/>
-          <w:sz w:val="24"/>
-        </w:rPr>
-        <w:t>15. 四项基本原则是？</w:t>
-      </w:r>
-    </w:p>
-    <w:p>
-      <w:pPr>
-        <w:spacing w:before="0" w:after="0"/>
-        <w:ind w:left="425"/>
-      </w:pPr>
-      <w:r>
-        <w:rPr>
-          <w:rFonts w:ascii="宋体" w:hAnsi="宋体" w:eastAsia="宋体"/>
-          <w:b w:val="0"/>
-          <w:color w:val="1A1A1A"/>
-          <w:sz w:val="24"/>
-        </w:rPr>
-        <w:t>答案：坚持社会主义道路、坚持人民民主专政、坚持中国共产党的领导、坚持马克思列宁主义毛泽东思想。</w:t>
-      </w:r>
-    </w:p>
-    <w:p>
-      <w:pPr>
-        <w:spacing w:before="160" w:after="40"/>
-      </w:pPr>
-      <w:r>
-        <w:rPr>
-          <w:rFonts w:ascii="宋体" w:hAnsi="宋体" w:eastAsia="宋体"/>
-          <w:b/>
-          <w:color w:val="1A1A1A"/>
-          <w:sz w:val="24"/>
-        </w:rPr>
-        <w:t>16. 我国的基本国情是什么？</w:t>
-      </w:r>
-    </w:p>
-    <w:p>
-      <w:pPr>
-        <w:spacing w:before="0" w:after="0"/>
-        <w:ind w:left="425"/>
-      </w:pPr>
-      <w:r>
-        <w:rPr>
-          <w:rFonts w:ascii="宋体" w:hAnsi="宋体" w:eastAsia="宋体"/>
-          <w:b w:val="0"/>
-          <w:color w:val="1A1A1A"/>
-          <w:sz w:val="24"/>
-        </w:rPr>
-        <w:t>答案：我国仍处于并将长期处于社会主义初级阶段。</w:t>
-      </w:r>
-    </w:p>
-    <w:p>
-      <w:pPr>
-        <w:spacing w:before="160" w:after="40"/>
-      </w:pPr>
-      <w:r>
-        <w:rPr>
-          <w:rFonts w:ascii="宋体" w:hAnsi="宋体" w:eastAsia="宋体"/>
-          <w:b/>
-          <w:color w:val="1A1A1A"/>
-          <w:sz w:val="24"/>
-        </w:rPr>
-        <w:t>17. 什么是和平共处五项基本原则？</w:t>
-      </w:r>
-    </w:p>
-    <w:p>
-      <w:pPr>
-        <w:spacing w:before="0" w:after="0"/>
-        <w:ind w:left="425"/>
-      </w:pPr>
-      <w:r>
-        <w:rPr>
-          <w:rFonts w:ascii="宋体" w:hAnsi="宋体" w:eastAsia="宋体"/>
-          <w:b w:val="0"/>
-          <w:color w:val="1A1A1A"/>
-          <w:sz w:val="24"/>
-        </w:rPr>
-        <w:t>答案：互相尊重主权和领土完整、互不侵犯、互不干涉内政、平等互利、和平共处。</w:t>
-      </w:r>
-    </w:p>
-    <w:p>
-      <w:pPr>
-        <w:spacing w:before="160" w:after="40"/>
-      </w:pPr>
-      <w:r>
-        <w:rPr>
-          <w:rFonts w:ascii="宋体" w:hAnsi="宋体" w:eastAsia="宋体"/>
-          <w:b/>
-          <w:color w:val="1A1A1A"/>
-          <w:sz w:val="24"/>
-        </w:rPr>
-        <w:t>18. 中国特色社会主义最本质的特征是？</w:t>
-      </w:r>
-    </w:p>
-    <w:p>
-      <w:pPr>
-        <w:spacing w:before="0" w:after="0"/>
-        <w:ind w:left="425"/>
-      </w:pPr>
-      <w:r>
-        <w:rPr>
-          <w:rFonts w:ascii="宋体" w:hAnsi="宋体" w:eastAsia="宋体"/>
-          <w:b w:val="0"/>
-          <w:color w:val="1A1A1A"/>
-          <w:sz w:val="24"/>
-        </w:rPr>
-        <w:t>答案：中国共产党的领导。</w:t>
-      </w:r>
-    </w:p>
-    <w:p>
-      <w:pPr>
-        <w:spacing w:before="160" w:after="40"/>
-      </w:pPr>
-      <w:r>
-        <w:rPr>
-          <w:rFonts w:ascii="宋体" w:hAnsi="宋体" w:eastAsia="宋体"/>
-          <w:b/>
-          <w:color w:val="1A1A1A"/>
-          <w:sz w:val="24"/>
-        </w:rPr>
-        <w:t>19. 党的全国代表大会每几年举行一次？</w:t>
-      </w:r>
-    </w:p>
-    <w:p>
-      <w:pPr>
-        <w:spacing w:before="0" w:after="0"/>
-        <w:ind w:left="425"/>
-      </w:pPr>
-      <w:r>
-        <w:rPr>
-          <w:rFonts w:ascii="宋体" w:hAnsi="宋体" w:eastAsia="宋体"/>
-          <w:b w:val="0"/>
-          <w:color w:val="1A1A1A"/>
-          <w:sz w:val="24"/>
-        </w:rPr>
-        <w:t>答案：五年</w:t>
-      </w:r>
-    </w:p>
-    <w:p>
-      <w:pPr>
-        <w:spacing w:before="160" w:after="40"/>
-      </w:pPr>
-      <w:r>
-        <w:rPr>
-          <w:rFonts w:ascii="宋体" w:hAnsi="宋体" w:eastAsia="宋体"/>
-          <w:b/>
-          <w:color w:val="1A1A1A"/>
-          <w:sz w:val="24"/>
-        </w:rPr>
-        <w:t>20. 对党员的纪律处分有哪五种？</w:t>
-      </w:r>
-    </w:p>
-    <w:p>
-      <w:pPr>
-        <w:spacing w:before="0" w:after="0"/>
-        <w:ind w:left="425"/>
-      </w:pPr>
-      <w:r>
-        <w:rPr>
-          <w:rFonts w:ascii="宋体" w:hAnsi="宋体" w:eastAsia="宋体"/>
-          <w:b w:val="0"/>
-          <w:color w:val="1A1A1A"/>
-          <w:sz w:val="24"/>
-        </w:rPr>
-        <w:t>答案：警告、严重警告、撤销党内职务、留党察看、开除党籍。</w:t>
-      </w:r>
-    </w:p>
-    <w:p>
-      <w:pPr>
-        <w:spacing w:before="160" w:after="40"/>
-      </w:pPr>
-      <w:r>
-        <w:rPr>
-          <w:rFonts w:ascii="宋体" w:hAnsi="宋体" w:eastAsia="宋体"/>
-          <w:b/>
-          <w:color w:val="1A1A1A"/>
-          <w:sz w:val="24"/>
-        </w:rPr>
-        <w:t>21. 什么是坚持和发展中国特色社会主义的本质要求和重要保障？</w:t>
-      </w:r>
-    </w:p>
-    <w:p>
-      <w:pPr>
-        <w:spacing w:before="0" w:after="0"/>
-        <w:ind w:left="425"/>
-      </w:pPr>
-      <w:r>
-        <w:rPr>
-          <w:rFonts w:ascii="宋体" w:hAnsi="宋体" w:eastAsia="宋体"/>
-          <w:b w:val="0"/>
-          <w:color w:val="1A1A1A"/>
-          <w:sz w:val="24"/>
-        </w:rPr>
-        <w:t>答案：全面依法治国</w:t>
-      </w:r>
-    </w:p>
-    <w:p>
-      <w:pPr>
-        <w:spacing w:before="160" w:after="40"/>
-      </w:pPr>
-      <w:r>
-        <w:rPr>
-          <w:rFonts w:ascii="宋体" w:hAnsi="宋体" w:eastAsia="宋体"/>
-          <w:b/>
-          <w:color w:val="1A1A1A"/>
-          <w:sz w:val="24"/>
-        </w:rPr>
-        <w:t>22. 什么是人民军队建军之本，强军之魂？</w:t>
-      </w:r>
-    </w:p>
-    <w:p>
-      <w:pPr>
-        <w:spacing w:before="0" w:after="0"/>
-        <w:ind w:left="425"/>
-      </w:pPr>
-      <w:r>
-        <w:rPr>
-          <w:rFonts w:ascii="宋体" w:hAnsi="宋体" w:eastAsia="宋体"/>
-          <w:b w:val="0"/>
-          <w:color w:val="1A1A1A"/>
-          <w:sz w:val="24"/>
-        </w:rPr>
-        <w:t>答案：党对军队绝对领导</w:t>
-      </w:r>
-    </w:p>
-    <w:p>
-      <w:pPr>
-        <w:spacing w:before="160" w:after="40"/>
-      </w:pPr>
-      <w:r>
-        <w:rPr>
-          <w:rFonts w:ascii="宋体" w:hAnsi="宋体" w:eastAsia="宋体"/>
-          <w:b/>
-          <w:color w:val="1A1A1A"/>
-          <w:sz w:val="24"/>
-        </w:rPr>
-        <w:t>23. 党的思想路线是什么？</w:t>
-      </w:r>
-    </w:p>
-    <w:p>
-      <w:pPr>
-        <w:spacing w:before="0" w:after="0"/>
-        <w:ind w:left="425"/>
-      </w:pPr>
-      <w:r>
-        <w:rPr>
-          <w:rFonts w:ascii="宋体" w:hAnsi="宋体" w:eastAsia="宋体"/>
-          <w:b w:val="0"/>
-          <w:color w:val="1A1A1A"/>
-          <w:sz w:val="24"/>
-        </w:rPr>
-        <w:t>答案：一切从实际出发，理论联系实际，实事求是，在实践中检验真理和发展真理。</w:t>
-      </w:r>
-    </w:p>
-    <w:p>
-      <w:pPr>
-        <w:spacing w:before="160" w:after="40"/>
-      </w:pPr>
-      <w:r>
-        <w:rPr>
-          <w:rFonts w:ascii="宋体" w:hAnsi="宋体" w:eastAsia="宋体"/>
-          <w:b/>
-          <w:color w:val="1A1A1A"/>
-          <w:sz w:val="24"/>
-        </w:rPr>
-        <w:t>24. 党执政兴国的第一要务是什么？</w:t>
-      </w:r>
-    </w:p>
-    <w:p>
-      <w:pPr>
-        <w:spacing w:before="0" w:after="0"/>
-        <w:ind w:left="425"/>
-      </w:pPr>
-      <w:r>
-        <w:rPr>
-          <w:rFonts w:ascii="宋体" w:hAnsi="宋体" w:eastAsia="宋体"/>
-          <w:b w:val="0"/>
-          <w:color w:val="1A1A1A"/>
-          <w:sz w:val="24"/>
-        </w:rPr>
-        <w:t>答案：发展。</w:t>
-      </w:r>
-    </w:p>
-    <w:p>
-      <w:pPr>
-        <w:spacing w:before="160" w:after="40"/>
-      </w:pPr>
-      <w:r>
-        <w:rPr>
-          <w:rFonts w:ascii="宋体" w:hAnsi="宋体" w:eastAsia="宋体"/>
-          <w:b/>
-          <w:color w:val="1A1A1A"/>
-          <w:sz w:val="24"/>
-        </w:rPr>
-        <w:t>25. 党的群众路线是什么？</w:t>
-      </w:r>
-    </w:p>
-    <w:p>
-      <w:pPr>
-        <w:spacing w:before="0" w:after="0"/>
-        <w:ind w:left="425"/>
-      </w:pPr>
-      <w:r>
-        <w:rPr>
-          <w:rFonts w:ascii="宋体" w:hAnsi="宋体" w:eastAsia="宋体"/>
-          <w:b w:val="0"/>
-          <w:color w:val="1A1A1A"/>
-          <w:sz w:val="24"/>
-        </w:rPr>
-        <w:t>答案：一切为了群众，一切依靠群众，从群众中来，到群众中去，把党的正确主张变为群众的自觉行动。</w:t>
-      </w:r>
-    </w:p>
-    <w:p>
-      <w:pPr>
-        <w:spacing w:before="160" w:after="40"/>
-      </w:pPr>
-      <w:r>
-        <w:rPr>
-          <w:rFonts w:ascii="宋体" w:hAnsi="宋体" w:eastAsia="宋体"/>
-          <w:b/>
-          <w:color w:val="1A1A1A"/>
-          <w:sz w:val="24"/>
-        </w:rPr>
-        <w:t>26. 预备党员的预备期是多久？</w:t>
-      </w:r>
-    </w:p>
-    <w:p>
-      <w:pPr>
-        <w:spacing w:before="0" w:after="0"/>
-        <w:ind w:left="425"/>
-      </w:pPr>
-      <w:r>
-        <w:rPr>
-          <w:rFonts w:ascii="宋体" w:hAnsi="宋体" w:eastAsia="宋体"/>
-          <w:b w:val="0"/>
-          <w:color w:val="1A1A1A"/>
-          <w:sz w:val="24"/>
-        </w:rPr>
-        <w:t>答案：一年</w:t>
-      </w:r>
-    </w:p>
-    <w:p>
-      <w:pPr>
-        <w:spacing w:before="160" w:after="40"/>
-      </w:pPr>
-      <w:r>
-        <w:rPr>
-          <w:rFonts w:ascii="宋体" w:hAnsi="宋体" w:eastAsia="宋体"/>
-          <w:b/>
-          <w:color w:val="1A1A1A"/>
-          <w:sz w:val="24"/>
-        </w:rPr>
-        <w:t>27. 预备党员的预备期，从哪一天算起？</w:t>
-      </w:r>
-    </w:p>
-    <w:p>
-      <w:pPr>
-        <w:spacing w:before="0" w:after="0"/>
-        <w:ind w:left="425"/>
-      </w:pPr>
-      <w:r>
-        <w:rPr>
-          <w:rFonts w:ascii="宋体" w:hAnsi="宋体" w:eastAsia="宋体"/>
-          <w:b w:val="0"/>
-          <w:color w:val="1A1A1A"/>
-          <w:sz w:val="24"/>
-        </w:rPr>
-        <w:t>答案：支部大会通过他为预备党员之日</w:t>
-      </w:r>
-    </w:p>
-    <w:p>
-      <w:pPr>
-        <w:spacing w:before="160" w:after="40"/>
-      </w:pPr>
-      <w:r>
-        <w:rPr>
-          <w:rFonts w:ascii="宋体" w:hAnsi="宋体" w:eastAsia="宋体"/>
-          <w:b/>
-          <w:color w:val="1A1A1A"/>
-          <w:sz w:val="24"/>
-        </w:rPr>
-        <w:t>28. 党员的党龄，从哪一天算起？</w:t>
-      </w:r>
-    </w:p>
-    <w:p>
-      <w:pPr>
-        <w:spacing w:before="0" w:after="0"/>
-        <w:ind w:left="425"/>
-      </w:pPr>
-      <w:r>
-        <w:rPr>
-          <w:rFonts w:ascii="宋体" w:hAnsi="宋体" w:eastAsia="宋体"/>
-          <w:b w:val="0"/>
-          <w:color w:val="1A1A1A"/>
-          <w:sz w:val="24"/>
-        </w:rPr>
-        <w:t>答案：预备期满转为正式党员之日</w:t>
-      </w:r>
-    </w:p>
-    <w:p>
-      <w:pPr>
-        <w:spacing w:before="160" w:after="40"/>
-      </w:pPr>
-      <w:r>
-        <w:rPr>
-          <w:rFonts w:ascii="宋体" w:hAnsi="宋体" w:eastAsia="宋体"/>
-          <w:b/>
-          <w:color w:val="1A1A1A"/>
-          <w:sz w:val="24"/>
-        </w:rPr>
-        <w:t>29. 四个自信？</w:t>
-      </w:r>
-    </w:p>
-    <w:p>
-      <w:pPr>
-        <w:spacing w:before="0" w:after="0"/>
-        <w:ind w:left="425"/>
-      </w:pPr>
-      <w:r>
-        <w:rPr>
-          <w:rFonts w:ascii="宋体" w:hAnsi="宋体" w:eastAsia="宋体"/>
-          <w:b w:val="0"/>
-          <w:color w:val="1A1A1A"/>
-          <w:sz w:val="24"/>
-        </w:rPr>
-        <w:t>答案：道路自信、理论自信、制度自信、文化自信</w:t>
-      </w:r>
-    </w:p>
-    <w:p>
-      <w:pPr>
-        <w:spacing w:before="160" w:after="40"/>
-      </w:pPr>
-      <w:r>
-        <w:rPr>
-          <w:rFonts w:ascii="宋体" w:hAnsi="宋体" w:eastAsia="宋体"/>
-          <w:b/>
-          <w:color w:val="1A1A1A"/>
-          <w:sz w:val="24"/>
-        </w:rPr>
-        <w:t>30. 一带一路哪一年开始的？</w:t>
-      </w:r>
-    </w:p>
-    <w:p>
-      <w:pPr>
-        <w:spacing w:before="0" w:after="0"/>
-        <w:ind w:left="425"/>
-      </w:pPr>
-      <w:r>
-        <w:rPr>
-          <w:rFonts w:ascii="宋体" w:hAnsi="宋体" w:eastAsia="宋体"/>
-          <w:b w:val="0"/>
-          <w:color w:val="1A1A1A"/>
-          <w:sz w:val="24"/>
-        </w:rPr>
-        <w:t>答案：2013年</w:t>
-      </w:r>
-    </w:p>
-    <w:p>
-      <w:pPr>
-        <w:spacing w:before="160" w:after="40"/>
-      </w:pPr>
-      <w:r>
-        <w:rPr>
-          <w:rFonts w:ascii="宋体" w:hAnsi="宋体" w:eastAsia="宋体"/>
-          <w:b/>
-          <w:color w:val="1A1A1A"/>
-          <w:sz w:val="24"/>
-        </w:rPr>
-        <w:t>31. 社会主义民主政治的本质属性是什么？</w:t>
-      </w:r>
-    </w:p>
-    <w:p>
-      <w:pPr>
-        <w:spacing w:before="0" w:after="0"/>
-        <w:ind w:left="425"/>
-      </w:pPr>
-      <w:r>
-        <w:rPr>
-          <w:rFonts w:ascii="宋体" w:hAnsi="宋体" w:eastAsia="宋体"/>
-          <w:b w:val="0"/>
-          <w:color w:val="1A1A1A"/>
-          <w:sz w:val="24"/>
-        </w:rPr>
-        <w:t>答案：全过程人民民主</w:t>
-      </w:r>
-    </w:p>
-    <w:p>
-      <w:pPr>
-        <w:spacing w:before="160" w:after="40"/>
-      </w:pPr>
-      <w:r>
-        <w:rPr>
-          <w:rFonts w:ascii="宋体" w:hAnsi="宋体" w:eastAsia="宋体"/>
-          <w:b/>
-          <w:color w:val="1A1A1A"/>
-          <w:sz w:val="24"/>
-        </w:rPr>
-        <w:t>32. 什么是新发展理念？</w:t>
-      </w:r>
-    </w:p>
-    <w:p>
-      <w:pPr>
-        <w:spacing w:before="0" w:after="0"/>
-        <w:ind w:left="425"/>
-      </w:pPr>
-      <w:r>
-        <w:rPr>
-          <w:rFonts w:ascii="宋体" w:hAnsi="宋体" w:eastAsia="宋体"/>
-          <w:b w:val="0"/>
-          <w:color w:val="1A1A1A"/>
-          <w:sz w:val="24"/>
-        </w:rPr>
-        <w:t>答案：创新、协调、绿色、开放、共享</w:t>
-      </w:r>
-    </w:p>
-    <w:p>
-      <w:pPr>
-        <w:spacing w:before="160" w:after="40"/>
-      </w:pPr>
-      <w:r>
-        <w:rPr>
-          <w:rFonts w:ascii="宋体" w:hAnsi="宋体" w:eastAsia="宋体"/>
-          <w:b/>
-          <w:color w:val="1A1A1A"/>
-          <w:sz w:val="24"/>
-        </w:rPr>
-        <w:t>33. 党和国家工作总基调？</w:t>
-      </w:r>
-    </w:p>
-    <w:p>
-      <w:pPr>
-        <w:spacing w:before="0" w:after="0"/>
-        <w:ind w:left="425"/>
-      </w:pPr>
-      <w:r>
-        <w:rPr>
-          <w:rFonts w:ascii="宋体" w:hAnsi="宋体" w:eastAsia="宋体"/>
-          <w:b w:val="0"/>
-          <w:color w:val="1A1A1A"/>
-          <w:sz w:val="24"/>
-        </w:rPr>
-        <w:t>答案：稳中求进</w:t>
-      </w:r>
-    </w:p>
-    <w:p>
-      <w:pPr>
-        <w:spacing w:before="160" w:after="40"/>
-      </w:pPr>
-      <w:r>
-        <w:rPr>
-          <w:rFonts w:ascii="宋体" w:hAnsi="宋体" w:eastAsia="宋体"/>
-          <w:b/>
-          <w:color w:val="1A1A1A"/>
-          <w:sz w:val="24"/>
-        </w:rPr>
-        <w:t>34. 党的根本组织原则是什么？</w:t>
-      </w:r>
-    </w:p>
-    <w:p>
-      <w:pPr>
-        <w:spacing w:before="0" w:after="0"/>
-        <w:ind w:left="425"/>
-      </w:pPr>
-      <w:r>
-        <w:rPr>
-          <w:rFonts w:ascii="宋体" w:hAnsi="宋体" w:eastAsia="宋体"/>
-          <w:b w:val="0"/>
-          <w:color w:val="1A1A1A"/>
-          <w:sz w:val="24"/>
-        </w:rPr>
-        <w:t>答案：民主集中制</w:t>
-      </w:r>
-    </w:p>
-    <w:p>
-      <w:pPr>
-        <w:spacing w:before="280" w:after="40"/>
-      </w:pPr>
-      <w:r>
-        <w:rPr>
-          <w:rFonts w:ascii="黑体" w:hAnsi="黑体" w:eastAsia="黑体"/>
-          <w:b/>
-          <w:color w:val="1A1A1A"/>
-          <w:sz w:val="32"/>
-        </w:rPr>
-        <w:t>五、单独提问（51 题）</w:t>
+        <w:t>四、单独提问（51 题）</w:t>
       </w:r>
     </w:p>
     <w:p>

</xml_diff>